<commit_message>
feat(preschool-teaching): nota header lists all CU WA (bold current); add pages baseline subcommand
Co-Authored-By: Claude Opus 5 <noreply@anthropic.com>
</commit_message>
<xml_diff>
--- a/preschool-teaching/output/05 3.3b Nota Pembelajaran (Kertas Penerangan)/CU C01-C05/3.3b-01 Nota Pembelajaran C01-W01 Handle pupil's arrival (P851).docx
+++ b/preschool-teaching/output/05 3.3b Nota Pembelajaran (Kertas Penerangan)/CU C01-C05/3.3b-01 Nota Pembelajaran C01-W01 Handle pupil's arrival (P851).docx
@@ -524,8 +524,27 @@
             <w:vAlign w:val="center"/>
           </w:tcPr>
           <w:p>
+            <w:r/>
             <w:r>
+              <w:rPr>
+                <w:b/>
+              </w:rPr>
               <w:t>P851-002-4:2025-C01-W01 / Handle pupil's arrival</w:t>
+            </w:r>
+          </w:p>
+          <w:p>
+            <w:r>
+              <w:t>P851-002-4:2025-C01-W02 / Handle pupil's recess time</w:t>
+            </w:r>
+          </w:p>
+          <w:p>
+            <w:r>
+              <w:t>P851-002-4:2025-C01-W03 / Handle pupil's toilet break</w:t>
+            </w:r>
+          </w:p>
+          <w:p>
+            <w:r>
+              <w:t>P851-002-4:2025-C01-W04 / Handle pupil's dismissal</w:t>
             </w:r>
           </w:p>
         </w:tc>

</xml_diff>